<commit_message>
uv fix, psalm 140
</commit_message>
<xml_diff>
--- a/flow/20230914_vu_template/drafts/2024-11-u/02-СБ-Акиндина_Пегасія.docx
+++ b/flow/20230914_vu_template/drafts/2024-11-u/02-СБ-Акиндина_Пегасія.docx
@@ -10095,12 +10095,8 @@
     </w:p>
     <w:p>
       <w:pPr>
-        <w:spacing w:after="120"/>
-        <w:rPr>
-          <w:rFonts w:ascii="Times New Roman" w:hAnsi="Times New Roman"/>
-          <w:sz w:val="24"/>
-          <w:szCs w:val="24"/>
-        </w:rPr>
+        <w:pStyle w:val="Normal"/>
+        <w:spacing w:after="120"/>
       </w:pPr>
       <w:r>
         <w:rPr>
@@ -10108,15 +10104,24 @@
           <w:b/>
           <w:color w:val="000000"/>
           <w:sz w:val="24"/>
-          <w:szCs w:val="24"/>
-        </w:rPr>
-        <w:t>Го</w:t>
-      </w:r>
-      <w:r>
-        <w:rPr>
-          <w:rFonts w:ascii="Times New Roman" w:hAnsi="Times New Roman"/>
-          <w:sz w:val="24"/>
-          <w:szCs w:val="24"/>
+        </w:rPr>
+        <w:t xml:space="preserve">Го́споди, взива́ю я до Те́бе, ви́слухай мене́.* </w:t>
+      </w:r>
+      <w:r>
+        <w:rPr>
+          <w:rFonts w:ascii="Times New Roman" w:hAnsi="Times New Roman"/>
+          <w:b/>
+          <w:color w:val="000000"/>
+          <w:sz w:val="24"/>
+        </w:rPr>
+        <w:t>Ви</w:t>
+      </w:r>
+      <w:r>
+        <w:rPr>
+          <w:rFonts w:ascii="Times New Roman" w:hAnsi="Times New Roman"/>
+          <w:b/>
+          <w:color w:val="000000"/>
+          <w:sz w:val="24"/>
         </w:rPr>
         <w:t>́</w:t>
       </w:r>
@@ -10126,15 +10131,69 @@
           <w:b/>
           <w:color w:val="000000"/>
           <w:sz w:val="24"/>
-          <w:szCs w:val="24"/>
+        </w:rPr>
+        <w:t>слухай мене</w:t>
+      </w:r>
+      <w:r>
+        <w:rPr>
+          <w:rFonts w:ascii="Times New Roman" w:hAnsi="Times New Roman"/>
+          <w:b/>
+          <w:color w:val="000000"/>
+          <w:sz w:val="24"/>
+        </w:rPr>
+        <w:t>́</w:t>
+      </w:r>
+      <w:r>
+        <w:rPr>
+          <w:rFonts w:ascii="Times New Roman" w:hAnsi="Times New Roman"/>
+          <w:b/>
+          <w:color w:val="000000"/>
+          <w:sz w:val="24"/>
+        </w:rPr>
+        <w:t>, Го</w:t>
+      </w:r>
+      <w:r>
+        <w:rPr>
+          <w:rFonts w:ascii="Times New Roman" w:hAnsi="Times New Roman"/>
+          <w:b/>
+          <w:color w:val="000000"/>
+          <w:sz w:val="24"/>
+        </w:rPr>
+        <w:t>́</w:t>
+      </w:r>
+      <w:r>
+        <w:rPr>
+          <w:rFonts w:ascii="Times New Roman" w:hAnsi="Times New Roman"/>
+          <w:b/>
+          <w:color w:val="000000"/>
+          <w:sz w:val="24"/>
+        </w:rPr>
+        <w:t>споди.* Го</w:t>
+      </w:r>
+      <w:r>
+        <w:rPr>
+          <w:rFonts w:ascii="Times New Roman" w:hAnsi="Times New Roman"/>
+          <w:b/>
+          <w:color w:val="000000"/>
+          <w:sz w:val="24"/>
+        </w:rPr>
+        <w:t>́</w:t>
+      </w:r>
+      <w:r>
+        <w:rPr>
+          <w:rFonts w:ascii="Times New Roman" w:hAnsi="Times New Roman"/>
+          <w:b/>
+          <w:color w:val="000000"/>
+          <w:sz w:val="24"/>
         </w:rPr>
         <w:t>споди, взива</w:t>
       </w:r>
       <w:r>
         <w:rPr>
           <w:rFonts w:ascii="Times New Roman" w:hAnsi="Times New Roman"/>
-          <w:sz w:val="24"/>
-          <w:szCs w:val="24"/>
+          <w:b/>
+          <w:color w:val="000000"/>
+          <w:sz w:val="24"/>
         </w:rPr>
         <w:t>́</w:t>
       </w:r>
@@ -10144,15 +10203,15 @@
           <w:b/>
           <w:color w:val="000000"/>
           <w:sz w:val="24"/>
-          <w:szCs w:val="24"/>
         </w:rPr>
         <w:t>ю я до Те</w:t>
       </w:r>
       <w:r>
         <w:rPr>
           <w:rFonts w:ascii="Times New Roman" w:hAnsi="Times New Roman"/>
-          <w:sz w:val="24"/>
-          <w:szCs w:val="24"/>
+          <w:b/>
+          <w:color w:val="000000"/>
+          <w:sz w:val="24"/>
         </w:rPr>
         <w:t>́</w:t>
       </w:r>
@@ -10162,15 +10221,15 @@
           <w:b/>
           <w:color w:val="000000"/>
           <w:sz w:val="24"/>
-          <w:szCs w:val="24"/>
         </w:rPr>
         <w:t>бе, ви</w:t>
       </w:r>
       <w:r>
         <w:rPr>
           <w:rFonts w:ascii="Times New Roman" w:hAnsi="Times New Roman"/>
-          <w:sz w:val="24"/>
-          <w:szCs w:val="24"/>
+          <w:b/>
+          <w:color w:val="000000"/>
+          <w:sz w:val="24"/>
         </w:rPr>
         <w:t>́</w:t>
       </w:r>
@@ -10180,15 +10239,15 @@
           <w:b/>
           <w:color w:val="000000"/>
           <w:sz w:val="24"/>
-          <w:szCs w:val="24"/>
         </w:rPr>
         <w:t>слухай мене</w:t>
       </w:r>
       <w:r>
         <w:rPr>
           <w:rFonts w:ascii="Times New Roman" w:hAnsi="Times New Roman"/>
-          <w:sz w:val="24"/>
-          <w:szCs w:val="24"/>
+          <w:b/>
+          <w:color w:val="000000"/>
+          <w:sz w:val="24"/>
         </w:rPr>
         <w:t>́</w:t>
       </w:r>
@@ -10198,15 +10257,15 @@
           <w:b/>
           <w:color w:val="000000"/>
           <w:sz w:val="24"/>
-          <w:szCs w:val="24"/>
-        </w:rPr>
-        <w:t>.* Ви</w:t>
-      </w:r>
-      <w:r>
-        <w:rPr>
-          <w:rFonts w:ascii="Times New Roman" w:hAnsi="Times New Roman"/>
-          <w:sz w:val="24"/>
-          <w:szCs w:val="24"/>
+        </w:rPr>
+        <w:t>.* Почу</w:t>
+      </w:r>
+      <w:r>
+        <w:rPr>
+          <w:rFonts w:ascii="Times New Roman" w:hAnsi="Times New Roman"/>
+          <w:b/>
+          <w:color w:val="000000"/>
+          <w:sz w:val="24"/>
         </w:rPr>
         <w:t>́</w:t>
       </w:r>
@@ -10216,15 +10275,15 @@
           <w:b/>
           <w:color w:val="000000"/>
           <w:sz w:val="24"/>
-          <w:szCs w:val="24"/>
-        </w:rPr>
-        <w:t>слухай мене, Го</w:t>
-      </w:r>
-      <w:r>
-        <w:rPr>
-          <w:rFonts w:ascii="Times New Roman" w:hAnsi="Times New Roman"/>
-          <w:sz w:val="24"/>
-          <w:szCs w:val="24"/>
+        </w:rPr>
+        <w:t>й го</w:t>
+      </w:r>
+      <w:r>
+        <w:rPr>
+          <w:rFonts w:ascii="Times New Roman" w:hAnsi="Times New Roman"/>
+          <w:b/>
+          <w:color w:val="000000"/>
+          <w:sz w:val="24"/>
         </w:rPr>
         <w:t>́</w:t>
       </w:r>
@@ -10234,15 +10293,15 @@
           <w:b/>
           <w:color w:val="000000"/>
           <w:sz w:val="24"/>
-          <w:szCs w:val="24"/>
-        </w:rPr>
-        <w:t>споди.* Го</w:t>
-      </w:r>
-      <w:r>
-        <w:rPr>
-          <w:rFonts w:ascii="Times New Roman" w:hAnsi="Times New Roman"/>
-          <w:sz w:val="24"/>
-          <w:szCs w:val="24"/>
+        </w:rPr>
+        <w:t>лос молі</w:t>
+      </w:r>
+      <w:r>
+        <w:rPr>
+          <w:rFonts w:ascii="Times New Roman" w:hAnsi="Times New Roman"/>
+          <w:b/>
+          <w:color w:val="000000"/>
+          <w:sz w:val="24"/>
         </w:rPr>
         <w:t>́</w:t>
       </w:r>
@@ -10252,15 +10311,15 @@
           <w:b/>
           <w:color w:val="000000"/>
           <w:sz w:val="24"/>
-          <w:szCs w:val="24"/>
-        </w:rPr>
-        <w:t>споди, взива</w:t>
-      </w:r>
-      <w:r>
-        <w:rPr>
-          <w:rFonts w:ascii="Times New Roman" w:hAnsi="Times New Roman"/>
-          <w:sz w:val="24"/>
-          <w:szCs w:val="24"/>
+        </w:rPr>
+        <w:t>ння мого</w:t>
+      </w:r>
+      <w:r>
+        <w:rPr>
+          <w:rFonts w:ascii="Times New Roman" w:hAnsi="Times New Roman"/>
+          <w:b/>
+          <w:color w:val="000000"/>
+          <w:sz w:val="24"/>
         </w:rPr>
         <w:t>́</w:t>
       </w:r>
@@ -10270,15 +10329,15 @@
           <w:b/>
           <w:color w:val="000000"/>
           <w:sz w:val="24"/>
-          <w:szCs w:val="24"/>
-        </w:rPr>
-        <w:t>ю я до Те</w:t>
-      </w:r>
-      <w:r>
-        <w:rPr>
-          <w:rFonts w:ascii="Times New Roman" w:hAnsi="Times New Roman"/>
-          <w:sz w:val="24"/>
-          <w:szCs w:val="24"/>
+        </w:rPr>
+        <w:t>,* коли</w:t>
+      </w:r>
+      <w:r>
+        <w:rPr>
+          <w:rFonts w:ascii="Times New Roman" w:hAnsi="Times New Roman"/>
+          <w:b/>
+          <w:color w:val="000000"/>
+          <w:sz w:val="24"/>
         </w:rPr>
         <w:t>́</w:t>
       </w:r>
@@ -10288,15 +10347,15 @@
           <w:b/>
           <w:color w:val="000000"/>
           <w:sz w:val="24"/>
-          <w:szCs w:val="24"/>
-        </w:rPr>
-        <w:t>бе, ви</w:t>
-      </w:r>
-      <w:r>
-        <w:rPr>
-          <w:rFonts w:ascii="Times New Roman" w:hAnsi="Times New Roman"/>
-          <w:sz w:val="24"/>
-          <w:szCs w:val="24"/>
+        </w:rPr>
+        <w:t xml:space="preserve"> взива</w:t>
+      </w:r>
+      <w:r>
+        <w:rPr>
+          <w:rFonts w:ascii="Times New Roman" w:hAnsi="Times New Roman"/>
+          <w:b/>
+          <w:color w:val="000000"/>
+          <w:sz w:val="24"/>
         </w:rPr>
         <w:t>́</w:t>
       </w:r>
@@ -10306,15 +10365,51 @@
           <w:b/>
           <w:color w:val="000000"/>
           <w:sz w:val="24"/>
-          <w:szCs w:val="24"/>
+        </w:rPr>
+        <w:t>ю до Те</w:t>
+      </w:r>
+      <w:r>
+        <w:rPr>
+          <w:rFonts w:ascii="Times New Roman" w:hAnsi="Times New Roman"/>
+          <w:b/>
+          <w:color w:val="000000"/>
+          <w:sz w:val="24"/>
+        </w:rPr>
+        <w:t>́</w:t>
+      </w:r>
+      <w:r>
+        <w:rPr>
+          <w:rFonts w:ascii="Times New Roman" w:hAnsi="Times New Roman"/>
+          <w:b/>
+          <w:color w:val="000000"/>
+          <w:sz w:val="24"/>
+        </w:rPr>
+        <w:t>бе.* Ви</w:t>
+      </w:r>
+      <w:r>
+        <w:rPr>
+          <w:rFonts w:ascii="Times New Roman" w:hAnsi="Times New Roman"/>
+          <w:b/>
+          <w:color w:val="000000"/>
+          <w:sz w:val="24"/>
+        </w:rPr>
+        <w:t>́</w:t>
+      </w:r>
+      <w:r>
+        <w:rPr>
+          <w:rFonts w:ascii="Times New Roman" w:hAnsi="Times New Roman"/>
+          <w:b/>
+          <w:color w:val="000000"/>
+          <w:sz w:val="24"/>
         </w:rPr>
         <w:t>слухай мене</w:t>
       </w:r>
       <w:r>
         <w:rPr>
           <w:rFonts w:ascii="Times New Roman" w:hAnsi="Times New Roman"/>
-          <w:sz w:val="24"/>
-          <w:szCs w:val="24"/>
+          <w:b/>
+          <w:color w:val="000000"/>
+          <w:sz w:val="24"/>
         </w:rPr>
         <w:t>́</w:t>
       </w:r>
@@ -10324,15 +10419,15 @@
           <w:b/>
           <w:color w:val="000000"/>
           <w:sz w:val="24"/>
-          <w:szCs w:val="24"/>
-        </w:rPr>
-        <w:t>.* Почу</w:t>
-      </w:r>
-      <w:r>
-        <w:rPr>
-          <w:rFonts w:ascii="Times New Roman" w:hAnsi="Times New Roman"/>
-          <w:sz w:val="24"/>
-          <w:szCs w:val="24"/>
+        </w:rPr>
+        <w:t>, Го</w:t>
+      </w:r>
+      <w:r>
+        <w:rPr>
+          <w:rFonts w:ascii="Times New Roman" w:hAnsi="Times New Roman"/>
+          <w:b/>
+          <w:color w:val="000000"/>
+          <w:sz w:val="24"/>
         </w:rPr>
         <w:t>́</w:t>
       </w:r>
@@ -10342,15 +10437,30 @@
           <w:b/>
           <w:color w:val="000000"/>
           <w:sz w:val="24"/>
-          <w:szCs w:val="24"/>
-        </w:rPr>
-        <w:t>й го</w:t>
-      </w:r>
-      <w:r>
-        <w:rPr>
-          <w:rFonts w:ascii="Times New Roman" w:hAnsi="Times New Roman"/>
-          <w:sz w:val="24"/>
-          <w:szCs w:val="24"/>
+        </w:rPr>
+        <w:t>споди.</w:t>
+      </w:r>
+    </w:p>
+    <w:p>
+      <w:pPr>
+        <w:pStyle w:val="Normal"/>
+        <w:spacing w:after="120"/>
+      </w:pPr>
+      <w:r>
+        <w:rPr>
+          <w:rFonts w:ascii="Times New Roman" w:hAnsi="Times New Roman"/>
+          <w:b/>
+          <w:color w:val="000000"/>
+          <w:sz w:val="24"/>
+        </w:rPr>
+        <w:t>Неха</w:t>
+      </w:r>
+      <w:r>
+        <w:rPr>
+          <w:rFonts w:ascii="Times New Roman" w:hAnsi="Times New Roman"/>
+          <w:b/>
+          <w:color w:val="000000"/>
+          <w:sz w:val="24"/>
         </w:rPr>
         <w:t>́</w:t>
       </w:r>
@@ -10360,15 +10470,15 @@
           <w:b/>
           <w:color w:val="000000"/>
           <w:sz w:val="24"/>
-          <w:szCs w:val="24"/>
-        </w:rPr>
-        <w:t>лос молі</w:t>
-      </w:r>
-      <w:r>
-        <w:rPr>
-          <w:rFonts w:ascii="Times New Roman" w:hAnsi="Times New Roman"/>
-          <w:sz w:val="24"/>
-          <w:szCs w:val="24"/>
+        </w:rPr>
+        <w:t>й піднесе</w:t>
+      </w:r>
+      <w:r>
+        <w:rPr>
+          <w:rFonts w:ascii="Times New Roman" w:hAnsi="Times New Roman"/>
+          <w:b/>
+          <w:color w:val="000000"/>
+          <w:sz w:val="24"/>
         </w:rPr>
         <w:t>́</w:t>
       </w:r>
@@ -10378,15 +10488,15 @@
           <w:b/>
           <w:color w:val="000000"/>
           <w:sz w:val="24"/>
-          <w:szCs w:val="24"/>
-        </w:rPr>
-        <w:t>ння мого</w:t>
-      </w:r>
-      <w:r>
-        <w:rPr>
-          <w:rFonts w:ascii="Times New Roman" w:hAnsi="Times New Roman"/>
-          <w:sz w:val="24"/>
-          <w:szCs w:val="24"/>
+        </w:rPr>
+        <w:t>ться моли</w:t>
+      </w:r>
+      <w:r>
+        <w:rPr>
+          <w:rFonts w:ascii="Times New Roman" w:hAnsi="Times New Roman"/>
+          <w:b/>
+          <w:color w:val="000000"/>
+          <w:sz w:val="24"/>
         </w:rPr>
         <w:t>́</w:t>
       </w:r>
@@ -10396,15 +10506,15 @@
           <w:b/>
           <w:color w:val="000000"/>
           <w:sz w:val="24"/>
-          <w:szCs w:val="24"/>
-        </w:rPr>
-        <w:t>,* коли</w:t>
-      </w:r>
-      <w:r>
-        <w:rPr>
-          <w:rFonts w:ascii="Times New Roman" w:hAnsi="Times New Roman"/>
-          <w:sz w:val="24"/>
-          <w:szCs w:val="24"/>
+        </w:rPr>
+        <w:t>тва моя</w:t>
+      </w:r>
+      <w:r>
+        <w:rPr>
+          <w:rFonts w:ascii="Times New Roman" w:hAnsi="Times New Roman"/>
+          <w:b/>
+          <w:color w:val="000000"/>
+          <w:sz w:val="24"/>
         </w:rPr>
         <w:t>́</w:t>
       </w:r>
@@ -10414,15 +10524,15 @@
           <w:b/>
           <w:color w:val="000000"/>
           <w:sz w:val="24"/>
-          <w:szCs w:val="24"/>
-        </w:rPr>
-        <w:t xml:space="preserve"> взива</w:t>
-      </w:r>
-      <w:r>
-        <w:rPr>
-          <w:rFonts w:ascii="Times New Roman" w:hAnsi="Times New Roman"/>
-          <w:sz w:val="24"/>
-          <w:szCs w:val="24"/>
+        </w:rPr>
+        <w:t>,* мов кади</w:t>
+      </w:r>
+      <w:r>
+        <w:rPr>
+          <w:rFonts w:ascii="Times New Roman" w:hAnsi="Times New Roman"/>
+          <w:b/>
+          <w:color w:val="000000"/>
+          <w:sz w:val="24"/>
         </w:rPr>
         <w:t>́</w:t>
       </w:r>
@@ -10432,15 +10542,15 @@
           <w:b/>
           <w:color w:val="000000"/>
           <w:sz w:val="24"/>
-          <w:szCs w:val="24"/>
-        </w:rPr>
-        <w:t>ю до Те</w:t>
-      </w:r>
-      <w:r>
-        <w:rPr>
-          <w:rFonts w:ascii="Times New Roman" w:hAnsi="Times New Roman"/>
-          <w:sz w:val="24"/>
-          <w:szCs w:val="24"/>
+        </w:rPr>
+        <w:t>ло пе</w:t>
+      </w:r>
+      <w:r>
+        <w:rPr>
+          <w:rFonts w:ascii="Times New Roman" w:hAnsi="Times New Roman"/>
+          <w:b/>
+          <w:color w:val="000000"/>
+          <w:sz w:val="24"/>
         </w:rPr>
         <w:t>́</w:t>
       </w:r>
@@ -10450,15 +10560,15 @@
           <w:b/>
           <w:color w:val="000000"/>
           <w:sz w:val="24"/>
-          <w:szCs w:val="24"/>
-        </w:rPr>
-        <w:t>бе.* Ви</w:t>
-      </w:r>
-      <w:r>
-        <w:rPr>
-          <w:rFonts w:ascii="Times New Roman" w:hAnsi="Times New Roman"/>
-          <w:sz w:val="24"/>
-          <w:szCs w:val="24"/>
+        </w:rPr>
+        <w:t>ред Тобо</w:t>
+      </w:r>
+      <w:r>
+        <w:rPr>
+          <w:rFonts w:ascii="Times New Roman" w:hAnsi="Times New Roman"/>
+          <w:b/>
+          <w:color w:val="000000"/>
+          <w:sz w:val="24"/>
         </w:rPr>
         <w:t>́</w:t>
       </w:r>
@@ -10468,15 +10578,114 @@
           <w:b/>
           <w:color w:val="000000"/>
           <w:sz w:val="24"/>
-          <w:szCs w:val="24"/>
+        </w:rPr>
+        <w:t>ю;* підно</w:t>
+      </w:r>
+      <w:r>
+        <w:rPr>
+          <w:rFonts w:ascii="Times New Roman" w:hAnsi="Times New Roman"/>
+          <w:b/>
+          <w:color w:val="000000"/>
+          <w:sz w:val="24"/>
+        </w:rPr>
+        <w:t>́</w:t>
+      </w:r>
+      <w:r>
+        <w:rPr>
+          <w:rFonts w:ascii="Times New Roman" w:hAnsi="Times New Roman"/>
+          <w:b/>
+          <w:color w:val="000000"/>
+          <w:sz w:val="24"/>
+        </w:rPr>
+        <w:t>шення рук мої</w:t>
+      </w:r>
+      <w:r>
+        <w:rPr>
+          <w:rFonts w:ascii="Times New Roman" w:hAnsi="Times New Roman"/>
+          <w:b/>
+          <w:color w:val="000000"/>
+          <w:sz w:val="24"/>
+        </w:rPr>
+        <w:t>́</w:t>
+      </w:r>
+      <w:r>
+        <w:rPr>
+          <w:rFonts w:ascii="Times New Roman" w:hAnsi="Times New Roman"/>
+          <w:b/>
+          <w:color w:val="000000"/>
+          <w:sz w:val="24"/>
+        </w:rPr>
+        <w:t>х,* як же</w:t>
+      </w:r>
+      <w:r>
+        <w:rPr>
+          <w:rFonts w:ascii="Times New Roman" w:hAnsi="Times New Roman"/>
+          <w:b/>
+          <w:color w:val="000000"/>
+          <w:sz w:val="24"/>
+        </w:rPr>
+        <w:t>́</w:t>
+      </w:r>
+      <w:r>
+        <w:rPr>
+          <w:rFonts w:ascii="Times New Roman" w:hAnsi="Times New Roman"/>
+          <w:b/>
+          <w:color w:val="000000"/>
+          <w:sz w:val="24"/>
+        </w:rPr>
+        <w:t>ртва вечі</w:t>
+      </w:r>
+      <w:r>
+        <w:rPr>
+          <w:rFonts w:ascii="Times New Roman" w:hAnsi="Times New Roman"/>
+          <w:b/>
+          <w:color w:val="000000"/>
+          <w:sz w:val="24"/>
+        </w:rPr>
+        <w:t>́</w:t>
+      </w:r>
+      <w:r>
+        <w:rPr>
+          <w:rFonts w:ascii="Times New Roman" w:hAnsi="Times New Roman"/>
+          <w:b/>
+          <w:color w:val="000000"/>
+          <w:sz w:val="24"/>
+        </w:rPr>
+        <w:t xml:space="preserve">рня.* </w:t>
+      </w:r>
+      <w:r>
+        <w:rPr>
+          <w:rFonts w:ascii="Times New Roman" w:hAnsi="Times New Roman"/>
+          <w:b/>
+          <w:color w:val="000000"/>
+          <w:sz w:val="24"/>
+        </w:rPr>
+        <w:t>Ви</w:t>
+      </w:r>
+      <w:r>
+        <w:rPr>
+          <w:rFonts w:ascii="Times New Roman" w:hAnsi="Times New Roman"/>
+          <w:b/>
+          <w:color w:val="000000"/>
+          <w:sz w:val="24"/>
+        </w:rPr>
+        <w:t>́</w:t>
+      </w:r>
+      <w:r>
+        <w:rPr>
+          <w:rFonts w:ascii="Times New Roman" w:hAnsi="Times New Roman"/>
+          <w:b/>
+          <w:color w:val="000000"/>
+          <w:sz w:val="24"/>
         </w:rPr>
         <w:t>слухай мене</w:t>
       </w:r>
       <w:r>
         <w:rPr>
           <w:rFonts w:ascii="Times New Roman" w:hAnsi="Times New Roman"/>
-          <w:sz w:val="24"/>
-          <w:szCs w:val="24"/>
+          <w:b/>
+          <w:color w:val="000000"/>
+          <w:sz w:val="24"/>
         </w:rPr>
         <w:t>́</w:t>
       </w:r>
@@ -10486,15 +10695,15 @@
           <w:b/>
           <w:color w:val="000000"/>
           <w:sz w:val="24"/>
-          <w:szCs w:val="24"/>
         </w:rPr>
         <w:t>, Го</w:t>
       </w:r>
       <w:r>
         <w:rPr>
           <w:rFonts w:ascii="Times New Roman" w:hAnsi="Times New Roman"/>
-          <w:sz w:val="24"/>
-          <w:szCs w:val="24"/>
+          <w:b/>
+          <w:color w:val="000000"/>
+          <w:sz w:val="24"/>
         </w:rPr>
         <w:t>́</w:t>
       </w:r>
@@ -10504,279 +10713,6 @@
           <w:b/>
           <w:color w:val="000000"/>
           <w:sz w:val="24"/>
-          <w:szCs w:val="24"/>
-        </w:rPr>
-        <w:t>споди.</w:t>
-      </w:r>
-    </w:p>
-    <w:p>
-      <w:pPr>
-        <w:spacing w:after="120"/>
-        <w:rPr>
-          <w:rFonts w:ascii="Times New Roman" w:hAnsi="Times New Roman"/>
-          <w:sz w:val="24"/>
-          <w:szCs w:val="24"/>
-        </w:rPr>
-      </w:pPr>
-      <w:r>
-        <w:rPr>
-          <w:rFonts w:ascii="Times New Roman" w:hAnsi="Times New Roman"/>
-          <w:b/>
-          <w:color w:val="000000"/>
-          <w:sz w:val="24"/>
-          <w:szCs w:val="24"/>
-        </w:rPr>
-        <w:t>Неха</w:t>
-      </w:r>
-      <w:r>
-        <w:rPr>
-          <w:rFonts w:ascii="Times New Roman" w:hAnsi="Times New Roman"/>
-          <w:sz w:val="24"/>
-          <w:szCs w:val="24"/>
-        </w:rPr>
-        <w:t>́</w:t>
-      </w:r>
-      <w:r>
-        <w:rPr>
-          <w:rFonts w:ascii="Times New Roman" w:hAnsi="Times New Roman"/>
-          <w:b/>
-          <w:color w:val="000000"/>
-          <w:sz w:val="24"/>
-          <w:szCs w:val="24"/>
-        </w:rPr>
-        <w:t>й піднесе</w:t>
-      </w:r>
-      <w:r>
-        <w:rPr>
-          <w:rFonts w:ascii="Times New Roman" w:hAnsi="Times New Roman"/>
-          <w:sz w:val="24"/>
-          <w:szCs w:val="24"/>
-        </w:rPr>
-        <w:t>́</w:t>
-      </w:r>
-      <w:r>
-        <w:rPr>
-          <w:rFonts w:ascii="Times New Roman" w:hAnsi="Times New Roman"/>
-          <w:b/>
-          <w:color w:val="000000"/>
-          <w:sz w:val="24"/>
-          <w:szCs w:val="24"/>
-        </w:rPr>
-        <w:t>ться моли</w:t>
-      </w:r>
-      <w:r>
-        <w:rPr>
-          <w:rFonts w:ascii="Times New Roman" w:hAnsi="Times New Roman"/>
-          <w:sz w:val="24"/>
-          <w:szCs w:val="24"/>
-        </w:rPr>
-        <w:t>́</w:t>
-      </w:r>
-      <w:r>
-        <w:rPr>
-          <w:rFonts w:ascii="Times New Roman" w:hAnsi="Times New Roman"/>
-          <w:b/>
-          <w:color w:val="000000"/>
-          <w:sz w:val="24"/>
-          <w:szCs w:val="24"/>
-        </w:rPr>
-        <w:t>тва моя</w:t>
-      </w:r>
-      <w:r>
-        <w:rPr>
-          <w:rFonts w:ascii="Times New Roman" w:hAnsi="Times New Roman"/>
-          <w:sz w:val="24"/>
-          <w:szCs w:val="24"/>
-        </w:rPr>
-        <w:t>́</w:t>
-      </w:r>
-      <w:r>
-        <w:rPr>
-          <w:rFonts w:ascii="Times New Roman" w:hAnsi="Times New Roman"/>
-          <w:b/>
-          <w:color w:val="000000"/>
-          <w:sz w:val="24"/>
-          <w:szCs w:val="24"/>
-        </w:rPr>
-        <w:t>,* мов кади</w:t>
-      </w:r>
-      <w:r>
-        <w:rPr>
-          <w:rFonts w:ascii="Times New Roman" w:hAnsi="Times New Roman"/>
-          <w:sz w:val="24"/>
-          <w:szCs w:val="24"/>
-        </w:rPr>
-        <w:t>́</w:t>
-      </w:r>
-      <w:r>
-        <w:rPr>
-          <w:rFonts w:ascii="Times New Roman" w:hAnsi="Times New Roman"/>
-          <w:b/>
-          <w:color w:val="000000"/>
-          <w:sz w:val="24"/>
-          <w:szCs w:val="24"/>
-        </w:rPr>
-        <w:t>ло пе</w:t>
-      </w:r>
-      <w:r>
-        <w:rPr>
-          <w:rFonts w:ascii="Times New Roman" w:hAnsi="Times New Roman"/>
-          <w:sz w:val="24"/>
-          <w:szCs w:val="24"/>
-        </w:rPr>
-        <w:t>́</w:t>
-      </w:r>
-      <w:r>
-        <w:rPr>
-          <w:rFonts w:ascii="Times New Roman" w:hAnsi="Times New Roman"/>
-          <w:b/>
-          <w:color w:val="000000"/>
-          <w:sz w:val="24"/>
-          <w:szCs w:val="24"/>
-        </w:rPr>
-        <w:t>ред Тобо</w:t>
-      </w:r>
-      <w:r>
-        <w:rPr>
-          <w:rFonts w:ascii="Times New Roman" w:hAnsi="Times New Roman"/>
-          <w:sz w:val="24"/>
-          <w:szCs w:val="24"/>
-        </w:rPr>
-        <w:t>́</w:t>
-      </w:r>
-      <w:r>
-        <w:rPr>
-          <w:rFonts w:ascii="Times New Roman" w:hAnsi="Times New Roman"/>
-          <w:b/>
-          <w:color w:val="000000"/>
-          <w:sz w:val="24"/>
-          <w:szCs w:val="24"/>
-        </w:rPr>
-        <w:t>ю;* підно</w:t>
-      </w:r>
-      <w:r>
-        <w:rPr>
-          <w:rFonts w:ascii="Times New Roman" w:hAnsi="Times New Roman"/>
-          <w:sz w:val="24"/>
-          <w:szCs w:val="24"/>
-        </w:rPr>
-        <w:t>́</w:t>
-      </w:r>
-      <w:r>
-        <w:rPr>
-          <w:rFonts w:ascii="Times New Roman" w:hAnsi="Times New Roman"/>
-          <w:b/>
-          <w:color w:val="000000"/>
-          <w:sz w:val="24"/>
-          <w:szCs w:val="24"/>
-        </w:rPr>
-        <w:t>шення рук мої</w:t>
-      </w:r>
-      <w:r>
-        <w:rPr>
-          <w:rFonts w:ascii="Times New Roman" w:hAnsi="Times New Roman"/>
-          <w:sz w:val="24"/>
-          <w:szCs w:val="24"/>
-        </w:rPr>
-        <w:t>́</w:t>
-      </w:r>
-      <w:r>
-        <w:rPr>
-          <w:rFonts w:ascii="Times New Roman" w:hAnsi="Times New Roman"/>
-          <w:b/>
-          <w:color w:val="000000"/>
-          <w:sz w:val="24"/>
-          <w:szCs w:val="24"/>
-        </w:rPr>
-        <w:t>х,* як же</w:t>
-      </w:r>
-      <w:r>
-        <w:rPr>
-          <w:rFonts w:ascii="Times New Roman" w:hAnsi="Times New Roman"/>
-          <w:sz w:val="24"/>
-          <w:szCs w:val="24"/>
-        </w:rPr>
-        <w:t>́</w:t>
-      </w:r>
-      <w:r>
-        <w:rPr>
-          <w:rFonts w:ascii="Times New Roman" w:hAnsi="Times New Roman"/>
-          <w:b/>
-          <w:color w:val="000000"/>
-          <w:sz w:val="24"/>
-          <w:szCs w:val="24"/>
-        </w:rPr>
-        <w:t>ртва вечі</w:t>
-      </w:r>
-      <w:r>
-        <w:rPr>
-          <w:rFonts w:ascii="Times New Roman" w:hAnsi="Times New Roman"/>
-          <w:sz w:val="24"/>
-          <w:szCs w:val="24"/>
-        </w:rPr>
-        <w:t>́</w:t>
-      </w:r>
-      <w:r>
-        <w:rPr>
-          <w:rFonts w:ascii="Times New Roman" w:hAnsi="Times New Roman"/>
-          <w:b/>
-          <w:color w:val="000000"/>
-          <w:sz w:val="24"/>
-          <w:szCs w:val="24"/>
-        </w:rPr>
-        <w:t>рня.* Ви</w:t>
-      </w:r>
-      <w:r>
-        <w:rPr>
-          <w:rFonts w:ascii="Times New Roman" w:hAnsi="Times New Roman"/>
-          <w:sz w:val="24"/>
-          <w:szCs w:val="24"/>
-        </w:rPr>
-        <w:t>́</w:t>
-      </w:r>
-      <w:r>
-        <w:rPr>
-          <w:rFonts w:ascii="Times New Roman" w:hAnsi="Times New Roman"/>
-          <w:b/>
-          <w:color w:val="000000"/>
-          <w:sz w:val="24"/>
-          <w:szCs w:val="24"/>
-        </w:rPr>
-        <w:t>слухай мене</w:t>
-      </w:r>
-      <w:r>
-        <w:rPr>
-          <w:rFonts w:ascii="Times New Roman" w:hAnsi="Times New Roman"/>
-          <w:sz w:val="24"/>
-          <w:szCs w:val="24"/>
-        </w:rPr>
-        <w:t>́</w:t>
-      </w:r>
-      <w:r>
-        <w:rPr>
-          <w:rFonts w:ascii="Times New Roman" w:hAnsi="Times New Roman"/>
-          <w:b/>
-          <w:color w:val="000000"/>
-          <w:sz w:val="24"/>
-          <w:szCs w:val="24"/>
-        </w:rPr>
-        <w:t>, Го</w:t>
-      </w:r>
-      <w:r>
-        <w:rPr>
-          <w:rFonts w:ascii="Times New Roman" w:hAnsi="Times New Roman"/>
-          <w:sz w:val="24"/>
-          <w:szCs w:val="24"/>
-        </w:rPr>
-        <w:t>́</w:t>
-      </w:r>
-      <w:r>
-        <w:rPr>
-          <w:rFonts w:ascii="Times New Roman" w:hAnsi="Times New Roman"/>
-          <w:b/>
-          <w:color w:val="000000"/>
-          <w:sz w:val="24"/>
-          <w:szCs w:val="24"/>
         </w:rPr>
         <w:t>споди.</w:t>
       </w:r>

</xml_diff>